<commit_message>
auto: checkpoint 2026-07-21 16:52:36
</commit_message>
<xml_diff>
--- a/output/FITFO-content-packaging.docx
+++ b/output/FITFO-content-packaging.docx
@@ -62,8 +62,8 @@
         </w:tblBorders>
       </w:tblPr>
       <w:tblGrid>
-        <w:gridCol w:w="3260"/>
-        <w:gridCol w:w="6100"/>
+        <w:gridCol w:w="3760"/>
+        <w:gridCol w:w="5600"/>
       </w:tblGrid>
       <w:tr>
         <w:trPr>
@@ -71,7 +71,7 @@
         </w:trPr>
         <w:tc>
           <w:tcPr>
-            <w:tcW w:type="dxa" w:w="3260"/>
+            <w:tcW w:type="dxa" w:w="3760"/>
             <w:shd w:fill="F2F3F7" w:color="auto" w:val="clear"/>
             <w:tcMar>
               <w:top w:type="dxa" w:w="110"/>
@@ -98,7 +98,7 @@
         </w:tc>
         <w:tc>
           <w:tcPr>
-            <w:tcW w:type="dxa" w:w="6100"/>
+            <w:tcW w:type="dxa" w:w="5600"/>
             <w:shd w:fill="F2F3F7" w:color="auto" w:val="clear"/>
             <w:tcMar>
               <w:top w:type="dxa" w:w="110"/>
@@ -119,7 +119,7 @@
                 <w:sz w:val="19"/>
                 <w:szCs w:val="19"/>
               </w:rPr>
-              <w:t xml:space="preserve">What YouTube used as the thumbnail</w:t>
+              <w:t xml:space="preserve">What YouTube picked as your thumbnail</w:t>
             </w:r>
           </w:p>
         </w:tc>
@@ -127,7 +127,7 @@
       <w:tr>
         <w:tc>
           <w:tcPr>
-            <w:tcW w:type="dxa" w:w="3260"/>
+            <w:tcW w:type="dxa" w:w="3760"/>
             <w:tcMar>
               <w:top w:type="dxa" w:w="110"/>
               <w:left w:type="dxa" w:w="140"/>
@@ -153,27 +153,72 @@
         </w:tc>
         <w:tc>
           <w:tcPr>
-            <w:tcW w:type="dxa" w:w="6100"/>
+            <w:tcW w:type="dxa" w:w="5600"/>
             <w:tcMar>
-              <w:top w:type="dxa" w:w="110"/>
+              <w:top w:type="dxa" w:w="130"/>
               <w:left w:type="dxa" w:w="140"/>
-              <w:bottom w:type="dxa" w:w="110"/>
+              <w:bottom w:type="dxa" w:w="130"/>
               <w:right w:type="dxa" w:w="140"/>
             </w:tcMar>
           </w:tcPr>
           <w:p>
             <w:pPr>
-              <w:spacing w:after="0" w:line="280"/>
+              <w:spacing w:after="70"/>
+            </w:pPr>
+            <w:r>
+              <w:drawing>
+                <wp:inline distT="0" distB="0" distL="0" distR="0">
+                  <wp:extent cx="3352800" cy="1885950"/>
+                  <wp:effectExtent t="0" r="0" b="0" l="0"/>
+                  <wp:docPr id="1" name="" descr="" title=""/>
+                  <wp:cNvGraphicFramePr>
+                    <a:graphicFrameLocks xmlns:a="http://schemas.openxmlformats.org/drawingml/2006/main" noChangeAspect="1"/>
+                  </wp:cNvGraphicFramePr>
+                  <a:graphic xmlns:a="http://schemas.openxmlformats.org/drawingml/2006/main">
+                    <a:graphicData uri="http://schemas.openxmlformats.org/drawingml/2006/picture">
+                      <pic:pic xmlns:pic="http://schemas.openxmlformats.org/drawingml/2006/picture">
+                        <pic:nvPicPr>
+                          <pic:cNvPr id="0" name="" descr=""/>
+                          <pic:cNvPicPr>
+                            <a:picLocks noChangeAspect="1" noChangeArrowheads="1"/>
+                          </pic:cNvPicPr>
+                        </pic:nvPicPr>
+                        <pic:blipFill>
+                          <a:blip r:embed="rId7" cstate="none"/>
+                          <a:srcRect/>
+                          <a:stretch>
+                            <a:fillRect/>
+                          </a:stretch>
+                        </pic:blipFill>
+                        <pic:spPr bwMode="auto">
+                          <a:xfrm>
+                            <a:off x="0" y="0"/>
+                            <a:ext cx="3352800" cy="1885950"/>
+                          </a:xfrm>
+                          <a:prstGeom prst="rect">
+                            <a:avLst/>
+                          </a:prstGeom>
+                        </pic:spPr>
+                      </pic:pic>
+                    </a:graphicData>
+                  </a:graphic>
+                </wp:inline>
+              </w:drawing>
+            </w:r>
+          </w:p>
+          <w:p>
+            <w:pPr>
+              <w:spacing w:after="0" w:line="260"/>
             </w:pPr>
             <w:r>
               <w:rPr>
-                <w:b w:val="false"/>
-                <w:bCs w:val="false"/>
+                <w:i/>
+                <w:iCs/>
                 <w:color w:val="5C6472"/>
-                <w:sz w:val="19"/>
-                <w:szCs w:val="19"/>
+                <w:sz w:val="17"/>
+                <w:szCs w:val="17"/>
               </w:rPr>
-              <w:t xml:space="preserve">Auto-frame. TradingView NQ, risk box visible, full browser and taskbar in shot.</w:t>
+              <w:t xml:space="preserve">Auto-frame. Real risk box, buried under the full browser and the taskbar.</w:t>
             </w:r>
           </w:p>
         </w:tc>
@@ -181,7 +226,7 @@
       <w:tr>
         <w:tc>
           <w:tcPr>
-            <w:tcW w:type="dxa" w:w="3260"/>
+            <w:tcW w:type="dxa" w:w="3760"/>
             <w:tcMar>
               <w:top w:type="dxa" w:w="110"/>
               <w:left w:type="dxa" w:w="140"/>
@@ -207,27 +252,72 @@
         </w:tc>
         <w:tc>
           <w:tcPr>
-            <w:tcW w:type="dxa" w:w="6100"/>
+            <w:tcW w:type="dxa" w:w="5600"/>
             <w:tcMar>
-              <w:top w:type="dxa" w:w="110"/>
+              <w:top w:type="dxa" w:w="130"/>
               <w:left w:type="dxa" w:w="140"/>
-              <w:bottom w:type="dxa" w:w="110"/>
+              <w:bottom w:type="dxa" w:w="130"/>
               <w:right w:type="dxa" w:w="140"/>
             </w:tcMar>
           </w:tcPr>
           <w:p>
             <w:pPr>
-              <w:spacing w:after="0" w:line="280"/>
+              <w:spacing w:after="70"/>
+            </w:pPr>
+            <w:r>
+              <w:drawing>
+                <wp:inline distT="0" distB="0" distL="0" distR="0">
+                  <wp:extent cx="3352800" cy="1885950"/>
+                  <wp:effectExtent t="0" r="0" b="0" l="0"/>
+                  <wp:docPr id="1" name="" descr="" title=""/>
+                  <wp:cNvGraphicFramePr>
+                    <a:graphicFrameLocks xmlns:a="http://schemas.openxmlformats.org/drawingml/2006/main" noChangeAspect="1"/>
+                  </wp:cNvGraphicFramePr>
+                  <a:graphic xmlns:a="http://schemas.openxmlformats.org/drawingml/2006/main">
+                    <a:graphicData uri="http://schemas.openxmlformats.org/drawingml/2006/picture">
+                      <pic:pic xmlns:pic="http://schemas.openxmlformats.org/drawingml/2006/picture">
+                        <pic:nvPicPr>
+                          <pic:cNvPr id="0" name="" descr=""/>
+                          <pic:cNvPicPr>
+                            <a:picLocks noChangeAspect="1" noChangeArrowheads="1"/>
+                          </pic:cNvPicPr>
+                        </pic:nvPicPr>
+                        <pic:blipFill>
+                          <a:blip r:embed="rId8" cstate="none"/>
+                          <a:srcRect/>
+                          <a:stretch>
+                            <a:fillRect/>
+                          </a:stretch>
+                        </pic:blipFill>
+                        <pic:spPr bwMode="auto">
+                          <a:xfrm>
+                            <a:off x="0" y="0"/>
+                            <a:ext cx="3352800" cy="1885950"/>
+                          </a:xfrm>
+                          <a:prstGeom prst="rect">
+                            <a:avLst/>
+                          </a:prstGeom>
+                        </pic:spPr>
+                      </pic:pic>
+                    </a:graphicData>
+                  </a:graphic>
+                </wp:inline>
+              </w:drawing>
+            </w:r>
+          </w:p>
+          <w:p>
+            <w:pPr>
+              <w:spacing w:after="0" w:line="260"/>
             </w:pPr>
             <w:r>
               <w:rPr>
-                <w:b w:val="false"/>
-                <w:bCs w:val="false"/>
+                <w:i/>
+                <w:iCs/>
                 <w:color w:val="5C6472"/>
-                <w:sz w:val="19"/>
-                <w:szCs w:val="19"/>
+                <w:sz w:val="17"/>
+                <w:szCs w:val="17"/>
               </w:rPr>
-              <w:t xml:space="preserve">Auto-frame. Bedroom, mid-word.</w:t>
+              <w:t xml:space="preserve">Auto-frame. Bedroom, caught mid-word.</w:t>
             </w:r>
           </w:p>
         </w:tc>
@@ -235,7 +325,7 @@
       <w:tr>
         <w:tc>
           <w:tcPr>
-            <w:tcW w:type="dxa" w:w="3260"/>
+            <w:tcW w:type="dxa" w:w="3760"/>
             <w:tcMar>
               <w:top w:type="dxa" w:w="110"/>
               <w:left w:type="dxa" w:w="140"/>
@@ -261,27 +351,72 @@
         </w:tc>
         <w:tc>
           <w:tcPr>
-            <w:tcW w:type="dxa" w:w="6100"/>
+            <w:tcW w:type="dxa" w:w="5600"/>
             <w:tcMar>
-              <w:top w:type="dxa" w:w="110"/>
+              <w:top w:type="dxa" w:w="130"/>
               <w:left w:type="dxa" w:w="140"/>
-              <w:bottom w:type="dxa" w:w="110"/>
+              <w:bottom w:type="dxa" w:w="130"/>
               <w:right w:type="dxa" w:w="140"/>
             </w:tcMar>
           </w:tcPr>
           <w:p>
             <w:pPr>
-              <w:spacing w:after="0" w:line="280"/>
+              <w:spacing w:after="70"/>
+            </w:pPr>
+            <w:r>
+              <w:drawing>
+                <wp:inline distT="0" distB="0" distL="0" distR="0">
+                  <wp:extent cx="3352800" cy="1885950"/>
+                  <wp:effectExtent t="0" r="0" b="0" l="0"/>
+                  <wp:docPr id="1" name="" descr="" title=""/>
+                  <wp:cNvGraphicFramePr>
+                    <a:graphicFrameLocks xmlns:a="http://schemas.openxmlformats.org/drawingml/2006/main" noChangeAspect="1"/>
+                  </wp:cNvGraphicFramePr>
+                  <a:graphic xmlns:a="http://schemas.openxmlformats.org/drawingml/2006/main">
+                    <a:graphicData uri="http://schemas.openxmlformats.org/drawingml/2006/picture">
+                      <pic:pic xmlns:pic="http://schemas.openxmlformats.org/drawingml/2006/picture">
+                        <pic:nvPicPr>
+                          <pic:cNvPr id="0" name="" descr=""/>
+                          <pic:cNvPicPr>
+                            <a:picLocks noChangeAspect="1" noChangeArrowheads="1"/>
+                          </pic:cNvPicPr>
+                        </pic:nvPicPr>
+                        <pic:blipFill>
+                          <a:blip r:embed="rId9" cstate="none"/>
+                          <a:srcRect/>
+                          <a:stretch>
+                            <a:fillRect/>
+                          </a:stretch>
+                        </pic:blipFill>
+                        <pic:spPr bwMode="auto">
+                          <a:xfrm>
+                            <a:off x="0" y="0"/>
+                            <a:ext cx="3352800" cy="1885950"/>
+                          </a:xfrm>
+                          <a:prstGeom prst="rect">
+                            <a:avLst/>
+                          </a:prstGeom>
+                        </pic:spPr>
+                      </pic:pic>
+                    </a:graphicData>
+                  </a:graphic>
+                </wp:inline>
+              </w:drawing>
+            </w:r>
+          </w:p>
+          <w:p>
+            <w:pPr>
+              <w:spacing w:after="0" w:line="260"/>
             </w:pPr>
             <w:r>
               <w:rPr>
-                <w:b w:val="false"/>
-                <w:bCs w:val="false"/>
+                <w:i/>
+                <w:iCs/>
                 <w:color w:val="5C6472"/>
-                <w:sz w:val="19"/>
-                <w:szCs w:val="19"/>
+                <w:sz w:val="17"/>
+                <w:szCs w:val="17"/>
               </w:rPr>
-              <w:t xml:space="preserve">Auto-frame. Payout page, repeated $2,000 PAID rows. Your biggest video.</w:t>
+              <w:t xml:space="preserve">Auto-frame. Payout page. Your biggest video, by accident.</w:t>
             </w:r>
           </w:p>
         </w:tc>
@@ -289,7 +424,7 @@
       <w:tr>
         <w:tc>
           <w:tcPr>
-            <w:tcW w:type="dxa" w:w="3260"/>
+            <w:tcW w:type="dxa" w:w="3760"/>
             <w:tcMar>
               <w:top w:type="dxa" w:w="110"/>
               <w:left w:type="dxa" w:w="140"/>
@@ -315,27 +450,72 @@
         </w:tc>
         <w:tc>
           <w:tcPr>
-            <w:tcW w:type="dxa" w:w="6100"/>
+            <w:tcW w:type="dxa" w:w="5600"/>
             <w:tcMar>
-              <w:top w:type="dxa" w:w="110"/>
+              <w:top w:type="dxa" w:w="130"/>
               <w:left w:type="dxa" w:w="140"/>
-              <w:bottom w:type="dxa" w:w="110"/>
+              <w:bottom w:type="dxa" w:w="130"/>
               <w:right w:type="dxa" w:w="140"/>
             </w:tcMar>
           </w:tcPr>
           <w:p>
             <w:pPr>
-              <w:spacing w:after="0" w:line="280"/>
+              <w:spacing w:after="70"/>
+            </w:pPr>
+            <w:r>
+              <w:drawing>
+                <wp:inline distT="0" distB="0" distL="0" distR="0">
+                  <wp:extent cx="3352800" cy="1885950"/>
+                  <wp:effectExtent t="0" r="0" b="0" l="0"/>
+                  <wp:docPr id="1" name="" descr="" title=""/>
+                  <wp:cNvGraphicFramePr>
+                    <a:graphicFrameLocks xmlns:a="http://schemas.openxmlformats.org/drawingml/2006/main" noChangeAspect="1"/>
+                  </wp:cNvGraphicFramePr>
+                  <a:graphic xmlns:a="http://schemas.openxmlformats.org/drawingml/2006/main">
+                    <a:graphicData uri="http://schemas.openxmlformats.org/drawingml/2006/picture">
+                      <pic:pic xmlns:pic="http://schemas.openxmlformats.org/drawingml/2006/picture">
+                        <pic:nvPicPr>
+                          <pic:cNvPr id="0" name="" descr=""/>
+                          <pic:cNvPicPr>
+                            <a:picLocks noChangeAspect="1" noChangeArrowheads="1"/>
+                          </pic:cNvPicPr>
+                        </pic:nvPicPr>
+                        <pic:blipFill>
+                          <a:blip r:embed="rId10" cstate="none"/>
+                          <a:srcRect/>
+                          <a:stretch>
+                            <a:fillRect/>
+                          </a:stretch>
+                        </pic:blipFill>
+                        <pic:spPr bwMode="auto">
+                          <a:xfrm>
+                            <a:off x="0" y="0"/>
+                            <a:ext cx="3352800" cy="1885950"/>
+                          </a:xfrm>
+                          <a:prstGeom prst="rect">
+                            <a:avLst/>
+                          </a:prstGeom>
+                        </pic:spPr>
+                      </pic:pic>
+                    </a:graphicData>
+                  </a:graphic>
+                </wp:inline>
+              </w:drawing>
+            </w:r>
+          </w:p>
+          <w:p>
+            <w:pPr>
+              <w:spacing w:after="0" w:line="260"/>
             </w:pPr>
             <w:r>
               <w:rPr>
-                <w:b w:val="false"/>
-                <w:bCs w:val="false"/>
+                <w:i/>
+                <w:iCs/>
                 <w:color w:val="5C6472"/>
-                <w:sz w:val="19"/>
-                <w:szCs w:val="19"/>
+                <w:sz w:val="17"/>
+                <w:szCs w:val="17"/>
               </w:rPr>
-              <w:t xml:space="preserve">Auto-frame. Bedroom, plain wall.</w:t>
+              <w:t xml:space="preserve">Auto-frame. Bedroom, plain wall, nothing to read.</w:t>
             </w:r>
           </w:p>
         </w:tc>
@@ -343,7 +523,7 @@
       <w:tr>
         <w:tc>
           <w:tcPr>
-            <w:tcW w:type="dxa" w:w="3260"/>
+            <w:tcW w:type="dxa" w:w="3760"/>
             <w:tcMar>
               <w:top w:type="dxa" w:w="110"/>
               <w:left w:type="dxa" w:w="140"/>
@@ -369,27 +549,72 @@
         </w:tc>
         <w:tc>
           <w:tcPr>
-            <w:tcW w:type="dxa" w:w="6100"/>
+            <w:tcW w:type="dxa" w:w="5600"/>
             <w:tcMar>
-              <w:top w:type="dxa" w:w="110"/>
+              <w:top w:type="dxa" w:w="130"/>
               <w:left w:type="dxa" w:w="140"/>
-              <w:bottom w:type="dxa" w:w="110"/>
+              <w:bottom w:type="dxa" w:w="130"/>
               <w:right w:type="dxa" w:w="140"/>
             </w:tcMar>
           </w:tcPr>
           <w:p>
             <w:pPr>
-              <w:spacing w:after="0" w:line="280"/>
+              <w:spacing w:after="70"/>
+            </w:pPr>
+            <w:r>
+              <w:drawing>
+                <wp:inline distT="0" distB="0" distL="0" distR="0">
+                  <wp:extent cx="3352800" cy="1885950"/>
+                  <wp:effectExtent t="0" r="0" b="0" l="0"/>
+                  <wp:docPr id="1" name="" descr="" title=""/>
+                  <wp:cNvGraphicFramePr>
+                    <a:graphicFrameLocks xmlns:a="http://schemas.openxmlformats.org/drawingml/2006/main" noChangeAspect="1"/>
+                  </wp:cNvGraphicFramePr>
+                  <a:graphic xmlns:a="http://schemas.openxmlformats.org/drawingml/2006/main">
+                    <a:graphicData uri="http://schemas.openxmlformats.org/drawingml/2006/picture">
+                      <pic:pic xmlns:pic="http://schemas.openxmlformats.org/drawingml/2006/picture">
+                        <pic:nvPicPr>
+                          <pic:cNvPr id="0" name="" descr=""/>
+                          <pic:cNvPicPr>
+                            <a:picLocks noChangeAspect="1" noChangeArrowheads="1"/>
+                          </pic:cNvPicPr>
+                        </pic:nvPicPr>
+                        <pic:blipFill>
+                          <a:blip r:embed="rId11" cstate="none"/>
+                          <a:srcRect/>
+                          <a:stretch>
+                            <a:fillRect/>
+                          </a:stretch>
+                        </pic:blipFill>
+                        <pic:spPr bwMode="auto">
+                          <a:xfrm>
+                            <a:off x="0" y="0"/>
+                            <a:ext cx="3352800" cy="1885950"/>
+                          </a:xfrm>
+                          <a:prstGeom prst="rect">
+                            <a:avLst/>
+                          </a:prstGeom>
+                        </pic:spPr>
+                      </pic:pic>
+                    </a:graphicData>
+                  </a:graphic>
+                </wp:inline>
+              </w:drawing>
+            </w:r>
+          </w:p>
+          <w:p>
+            <w:pPr>
+              <w:spacing w:after="0" w:line="260"/>
             </w:pPr>
             <w:r>
               <w:rPr>
-                <w:b w:val="false"/>
-                <w:bCs w:val="false"/>
+                <w:i/>
+                <w:iCs/>
                 <w:color w:val="5C6472"/>
-                <w:sz w:val="19"/>
-                <w:szCs w:val="19"/>
+                <w:sz w:val="17"/>
+                <w:szCs w:val="17"/>
               </w:rPr>
-              <w:t xml:space="preserve">Auto-frame. Bedroom, mid-blink.</w:t>
+              <w:t xml:space="preserve">Auto-frame. Bedroom, mid-blink. No sign there is a $20k loss inside.</w:t>
             </w:r>
           </w:p>
         </w:tc>

</xml_diff>

<commit_message>
auto: checkpoint 2026-07-21 18:55:55
</commit_message>
<xml_diff>
--- a/output/FITFO-content-packaging.docx
+++ b/output/FITFO-content-packaging.docx
@@ -795,7 +795,20 @@
           <w:sz w:val="21"/>
           <w:szCs w:val="21"/>
         </w:rPr>
-        <w:t xml:space="preserve">The title carries the full context, the thumbnail text carries the punchline, and neither repeats the other.</w:t>
+        <w:t xml:space="preserve">The good news first: you do not need to shoot anything new for three of these. Your screen recordings already contain the right thumbnail, it is just buried under browser chrome. The job is cropping and a light retouch, not a photoshoot.</w:t>
+      </w:r>
+    </w:p>
+    <w:p>
+      <w:pPr>
+        <w:spacing w:after="200" w:line="300"/>
+      </w:pPr>
+      <w:r>
+        <w:rPr>
+          <w:color w:val="5C6472"/>
+          <w:sz w:val="21"/>
+          <w:szCs w:val="21"/>
+        </w:rPr>
+        <w:t xml:space="preserve">Two layouts cover everything on this channel. Screen recording means the real interface fills the frame with your face in a small corner inset, exactly like a webcam overlay. Raw photo means you in your real room, cleaned up, nothing added. Both stay quiet on text, because a real number and a real face already do the work, and loud text is what makes a channel read as a guru channel.</w:t>
       </w:r>
     </w:p>
     <w:p>
@@ -860,7 +873,148 @@
           <w:sz w:val="21"/>
           <w:szCs w:val="21"/>
         </w:rPr>
-        <w:t xml:space="preserve">Thumbnail text: </w:t>
+        <w:t xml:space="preserve">Thumbnail: </w:t>
+      </w:r>
+      <w:r>
+        <w:rPr>
+          <w:color w:val="1A1A1A"/>
+          <w:sz w:val="21"/>
+          <w:szCs w:val="21"/>
+        </w:rPr>
+        <w:t xml:space="preserve">screen recording</w:t>
+      </w:r>
+    </w:p>
+    <w:p>
+      <w:pPr>
+        <w:pStyle w:val="ListParagraph"/>
+        <w:numPr>
+          <w:ilvl w:val="0"/>
+          <w:numId w:val="2"/>
+        </w:numPr>
+        <w:spacing w:after="90" w:line="290"/>
+      </w:pPr>
+      <w:r>
+        <w:rPr>
+          <w:b/>
+          <w:bCs/>
+          <w:color w:val="4A53D9"/>
+          <w:sz w:val="21"/>
+          <w:szCs w:val="21"/>
+        </w:rPr>
+        <w:t xml:space="preserve">What to do: </w:t>
+      </w:r>
+      <w:r>
+        <w:rPr>
+          <w:color w:val="1A1A1A"/>
+          <w:sz w:val="21"/>
+          <w:szCs w:val="21"/>
+        </w:rPr>
+        <w:t xml:space="preserve">the drawdown on your platform filling the frame, browser tabs and taskbar cropped out, your face in a small inset bottom right</w:t>
+      </w:r>
+    </w:p>
+    <w:p>
+      <w:pPr>
+        <w:pStyle w:val="ListParagraph"/>
+        <w:numPr>
+          <w:ilvl w:val="0"/>
+          <w:numId w:val="2"/>
+        </w:numPr>
+        <w:spacing w:after="90" w:line="290"/>
+      </w:pPr>
+      <w:r>
+        <w:rPr>
+          <w:b/>
+          <w:bCs/>
+          <w:color w:val="4A53D9"/>
+          <w:sz w:val="21"/>
+          <w:szCs w:val="21"/>
+        </w:rPr>
+        <w:t xml:space="preserve">Text on it: </w:t>
+      </w:r>
+      <w:r>
+        <w:rPr>
+          <w:color w:val="1A1A1A"/>
+          <w:sz w:val="21"/>
+          <w:szCs w:val="21"/>
+        </w:rPr>
+        <w:t xml:space="preserve">none, or "still funded" small and lowercase in a corner</w:t>
+      </w:r>
+    </w:p>
+    <w:p>
+      <w:pPr>
+        <w:pStyle w:val="ListParagraph"/>
+        <w:numPr>
+          <w:ilvl w:val="0"/>
+          <w:numId w:val="2"/>
+        </w:numPr>
+        <w:spacing w:after="90" w:line="290"/>
+      </w:pPr>
+      <w:r>
+        <w:rPr>
+          <w:b/>
+          <w:bCs/>
+          <w:color w:val="4A53D9"/>
+          <w:sz w:val="21"/>
+          <w:szCs w:val="21"/>
+        </w:rPr>
+        <w:t xml:space="preserve">Why it pairs: </w:t>
+      </w:r>
+      <w:r>
+        <w:rPr>
+          <w:color w:val="1A1A1A"/>
+          <w:sz w:val="21"/>
+          <w:szCs w:val="21"/>
+        </w:rPr>
+        <w:t xml:space="preserve">the title gives the loss, the screen proves it is real</w:t>
+      </w:r>
+    </w:p>
+    <w:p>
+      <w:pPr>
+        <w:spacing w:after="200" w:line="300"/>
+      </w:pPr>
+      <w:r>
+        <w:rPr>
+          <w:color w:val="5C6472"/>
+          <w:sz w:val="21"/>
+          <w:szCs w:val="21"/>
+        </w:rPr>
+        <w:t xml:space="preserve">The number was already your strongest asset and it was sitting in brackets at the very end, which is exactly where a phone cuts the title off.</w:t>
+      </w:r>
+    </w:p>
+    <w:p>
+      <w:pPr>
+        <w:pStyle w:val="Heading2"/>
+        <w:spacing w:after="120" w:before="300"/>
+      </w:pPr>
+      <w:r>
+        <w:rPr>
+          <w:b/>
+          <w:bCs/>
+          <w:color w:val="1A1A1A"/>
+          <w:sz w:val="24"/>
+          <w:szCs w:val="24"/>
+        </w:rPr>
+        <w:t xml:space="preserve">2. Your payout video</w:t>
+      </w:r>
+    </w:p>
+    <w:p>
+      <w:pPr>
+        <w:pStyle w:val="ListParagraph"/>
+        <w:numPr>
+          <w:ilvl w:val="0"/>
+          <w:numId w:val="2"/>
+        </w:numPr>
+        <w:spacing w:after="90" w:line="290"/>
+      </w:pPr>
+      <w:r>
+        <w:rPr>
+          <w:b/>
+          <w:bCs/>
+          <w:color w:val="4A53D9"/>
+          <w:sz w:val="21"/>
+          <w:szCs w:val="21"/>
+        </w:rPr>
+        <w:t xml:space="preserve">Title: </w:t>
       </w:r>
       <w:r>
         <w:rPr>
@@ -869,7 +1023,7 @@
           <w:sz w:val="20"/>
           <w:szCs w:val="20"/>
         </w:rPr>
-        <w:t xml:space="preserve">still funded</w:t>
+        <w:t xml:space="preserve">5 funded accounts, $2k payouts each (full breakdown)</w:t>
       </w:r>
     </w:p>
     <w:p>
@@ -889,15 +1043,15 @@
           <w:sz w:val="21"/>
           <w:szCs w:val="21"/>
         </w:rPr>
-        <w:t xml:space="preserve">Background: </w:t>
-      </w:r>
-      <w:r>
-        <w:rPr>
-          <w:color w:val="1A1A1A"/>
-          <w:sz w:val="21"/>
-          <w:szCs w:val="21"/>
-        </w:rPr>
-        <w:t xml:space="preserve">your desk, red session on screen, face inset</w:t>
+        <w:t xml:space="preserve">Thumbnail: </w:t>
+      </w:r>
+      <w:r>
+        <w:rPr>
+          <w:color w:val="1A1A1A"/>
+          <w:sz w:val="21"/>
+          <w:szCs w:val="21"/>
+        </w:rPr>
+        <w:t xml:space="preserve">screen recording</w:t>
       </w:r>
     </w:p>
     <w:p>
@@ -917,15 +1071,15 @@
           <w:sz w:val="21"/>
           <w:szCs w:val="21"/>
         </w:rPr>
-        <w:t xml:space="preserve">Expression: </w:t>
-      </w:r>
-      <w:r>
-        <w:rPr>
-          <w:color w:val="1A1A1A"/>
-          <w:sz w:val="21"/>
-          <w:szCs w:val="21"/>
-        </w:rPr>
-        <w:t xml:space="preserve">flat and tired, no forced grin</w:t>
+        <w:t xml:space="preserve">What to do: </w:t>
+      </w:r>
+      <w:r>
+        <w:rPr>
+          <w:color w:val="1A1A1A"/>
+          <w:sz w:val="21"/>
+          <w:szCs w:val="21"/>
+        </w:rPr>
+        <w:t xml:space="preserve">your payout page as it already appears, but cropped hard: kill the browser window, sidebar, URL bar, taskbar and weather widget, then scale the PAID column until it reads at phone size. Keep the account IDs and dates, they are what make it checkable. Face inset bottom right</w:t>
       </w:r>
     </w:p>
     <w:p>
@@ -945,6 +1099,34 @@
           <w:sz w:val="21"/>
           <w:szCs w:val="21"/>
         </w:rPr>
+        <w:t xml:space="preserve">Text on it: </w:t>
+      </w:r>
+      <w:r>
+        <w:rPr>
+          <w:color w:val="1A1A1A"/>
+          <w:sz w:val="21"/>
+          <w:szCs w:val="21"/>
+        </w:rPr>
+        <w:t xml:space="preserve">none</w:t>
+      </w:r>
+    </w:p>
+    <w:p>
+      <w:pPr>
+        <w:pStyle w:val="ListParagraph"/>
+        <w:numPr>
+          <w:ilvl w:val="0"/>
+          <w:numId w:val="2"/>
+        </w:numPr>
+        <w:spacing w:after="90" w:line="290"/>
+      </w:pPr>
+      <w:r>
+        <w:rPr>
+          <w:b/>
+          <w:bCs/>
+          <w:color w:val="4A53D9"/>
+          <w:sz w:val="21"/>
+          <w:szCs w:val="21"/>
+        </w:rPr>
         <w:t xml:space="preserve">Why it pairs: </w:t>
       </w:r>
       <w:r>
@@ -953,7 +1135,7 @@
           <w:sz w:val="21"/>
           <w:szCs w:val="21"/>
         </w:rPr>
-        <w:t xml:space="preserve">the title gives the loss, the thumbnail gives the reason to keep watching</w:t>
+        <w:t xml:space="preserve">the title gives the payout, the ledger is the proof, nothing else needed</w:t>
       </w:r>
     </w:p>
     <w:p>
@@ -966,7 +1148,7 @@
           <w:sz w:val="21"/>
           <w:szCs w:val="21"/>
         </w:rPr>
-        <w:t xml:space="preserve">The number was already your strongest asset and it was sitting in brackets at the very end, which is exactly where a phone cuts the title off.</w:t>
+        <w:t xml:space="preserve">This is the one you already got right by accident. Your biggest video is this exact layout, chosen for you at random by YouTube. Doing it on purpose is the whole play.</w:t>
       </w:r>
     </w:p>
     <w:p>
@@ -982,7 +1164,7 @@
           <w:sz w:val="24"/>
           <w:szCs w:val="24"/>
         </w:rPr>
-        <w:t xml:space="preserve">2. Your payout video</w:t>
+        <w:t xml:space="preserve">3. Your risk management video</w:t>
       </w:r>
     </w:p>
     <w:p>
@@ -1011,7 +1193,7 @@
           <w:sz w:val="20"/>
           <w:szCs w:val="20"/>
         </w:rPr>
-        <w:t xml:space="preserve">5 funded accounts, $2k payouts each (full breakdown)</w:t>
+        <w:t xml:space="preserve">the risk plan that gets me 4r on nq (step by step)</w:t>
       </w:r>
     </w:p>
     <w:p>
@@ -1031,7 +1213,148 @@
           <w:sz w:val="21"/>
           <w:szCs w:val="21"/>
         </w:rPr>
-        <w:t xml:space="preserve">Thumbnail text: </w:t>
+        <w:t xml:space="preserve">Thumbnail: </w:t>
+      </w:r>
+      <w:r>
+        <w:rPr>
+          <w:color w:val="1A1A1A"/>
+          <w:sz w:val="21"/>
+          <w:szCs w:val="21"/>
+        </w:rPr>
+        <w:t xml:space="preserve">screen recording</w:t>
+      </w:r>
+    </w:p>
+    <w:p>
+      <w:pPr>
+        <w:pStyle w:val="ListParagraph"/>
+        <w:numPr>
+          <w:ilvl w:val="0"/>
+          <w:numId w:val="2"/>
+        </w:numPr>
+        <w:spacing w:after="90" w:line="290"/>
+      </w:pPr>
+      <w:r>
+        <w:rPr>
+          <w:b/>
+          <w:bCs/>
+          <w:color w:val="4A53D9"/>
+          <w:sz w:val="21"/>
+          <w:szCs w:val="21"/>
+        </w:rPr>
+        <w:t xml:space="preserve">What to do: </w:t>
+      </w:r>
+      <w:r>
+        <w:rPr>
+          <w:color w:val="1A1A1A"/>
+          <w:sz w:val="21"/>
+          <w:szCs w:val="21"/>
+        </w:rPr>
+        <w:t xml:space="preserve">crop to the risk box alone, green target block and red stop block, the ratio still legible. Toolbar, sidebar and taskbar gone. Face inset bottom left so it does not cover the box</w:t>
+      </w:r>
+    </w:p>
+    <w:p>
+      <w:pPr>
+        <w:pStyle w:val="ListParagraph"/>
+        <w:numPr>
+          <w:ilvl w:val="0"/>
+          <w:numId w:val="2"/>
+        </w:numPr>
+        <w:spacing w:after="90" w:line="290"/>
+      </w:pPr>
+      <w:r>
+        <w:rPr>
+          <w:b/>
+          <w:bCs/>
+          <w:color w:val="4A53D9"/>
+          <w:sz w:val="21"/>
+          <w:szCs w:val="21"/>
+        </w:rPr>
+        <w:t xml:space="preserve">Text on it: </w:t>
+      </w:r>
+      <w:r>
+        <w:rPr>
+          <w:color w:val="1A1A1A"/>
+          <w:sz w:val="21"/>
+          <w:szCs w:val="21"/>
+        </w:rPr>
+        <w:t xml:space="preserve">none, or "chop" small and lowercase</w:t>
+      </w:r>
+    </w:p>
+    <w:p>
+      <w:pPr>
+        <w:pStyle w:val="ListParagraph"/>
+        <w:numPr>
+          <w:ilvl w:val="0"/>
+          <w:numId w:val="2"/>
+        </w:numPr>
+        <w:spacing w:after="90" w:line="290"/>
+      </w:pPr>
+      <w:r>
+        <w:rPr>
+          <w:b/>
+          <w:bCs/>
+          <w:color w:val="4A53D9"/>
+          <w:sz w:val="21"/>
+          <w:szCs w:val="21"/>
+        </w:rPr>
+        <w:t xml:space="preserve">Why it pairs: </w:t>
+      </w:r>
+      <w:r>
+        <w:rPr>
+          <w:color w:val="1A1A1A"/>
+          <w:sz w:val="21"/>
+          <w:szCs w:val="21"/>
+        </w:rPr>
+        <w:t xml:space="preserve">the title gives the method and the ratio, the chart shows the setup surviving</w:t>
+      </w:r>
+    </w:p>
+    <w:p>
+      <w:pPr>
+        <w:spacing w:after="200" w:line="300"/>
+      </w:pPr>
+      <w:r>
+        <w:rPr>
+          <w:color w:val="5C6472"/>
+          <w:sz w:val="21"/>
+          <w:szCs w:val="21"/>
+        </w:rPr>
+        <w:t xml:space="preserve">Your existing frame is the best of the five by accident. There is a real risk box on a real chart in it, buried under the interface. Crop to the box and it works.</w:t>
+      </w:r>
+    </w:p>
+    <w:p>
+      <w:pPr>
+        <w:pStyle w:val="Heading2"/>
+        <w:spacing w:after="120" w:before="300"/>
+      </w:pPr>
+      <w:r>
+        <w:rPr>
+          <w:b/>
+          <w:bCs/>
+          <w:color w:val="1A1A1A"/>
+          <w:sz w:val="24"/>
+          <w:szCs w:val="24"/>
+        </w:rPr>
+        <w:t xml:space="preserve">4. Your losing weeks video</w:t>
+      </w:r>
+    </w:p>
+    <w:p>
+      <w:pPr>
+        <w:pStyle w:val="ListParagraph"/>
+        <w:numPr>
+          <w:ilvl w:val="0"/>
+          <w:numId w:val="2"/>
+        </w:numPr>
+        <w:spacing w:after="90" w:line="290"/>
+      </w:pPr>
+      <w:r>
+        <w:rPr>
+          <w:b/>
+          <w:bCs/>
+          <w:color w:val="4A53D9"/>
+          <w:sz w:val="21"/>
+          <w:szCs w:val="21"/>
+        </w:rPr>
+        <w:t xml:space="preserve">Title: </w:t>
       </w:r>
       <w:r>
         <w:rPr>
@@ -1040,7 +1363,7 @@
           <w:sz w:val="20"/>
           <w:szCs w:val="20"/>
         </w:rPr>
-        <w:t xml:space="preserve">nothing blown yet</w:t>
+        <w:t xml:space="preserve">stop trading after a red week, do this instead (copy me)</w:t>
       </w:r>
     </w:p>
     <w:p>
@@ -1060,15 +1383,15 @@
           <w:sz w:val="21"/>
           <w:szCs w:val="21"/>
         </w:rPr>
-        <w:t xml:space="preserve">Background: </w:t>
-      </w:r>
-      <w:r>
-        <w:rPr>
-          <w:color w:val="1A1A1A"/>
-          <w:sz w:val="21"/>
-          <w:szCs w:val="21"/>
-        </w:rPr>
-        <w:t xml:space="preserve">desk, charts on screen, face inset</w:t>
+        <w:t xml:space="preserve">Thumbnail: </w:t>
+      </w:r>
+      <w:r>
+        <w:rPr>
+          <w:color w:val="1A1A1A"/>
+          <w:sz w:val="21"/>
+          <w:szCs w:val="21"/>
+        </w:rPr>
+        <w:t xml:space="preserve">raw photo</w:t>
       </w:r>
     </w:p>
     <w:p>
@@ -1088,15 +1411,15 @@
           <w:sz w:val="21"/>
           <w:szCs w:val="21"/>
         </w:rPr>
-        <w:t xml:space="preserve">Expression: </w:t>
-      </w:r>
-      <w:r>
-        <w:rPr>
-          <w:color w:val="1A1A1A"/>
-          <w:sz w:val="21"/>
-          <w:szCs w:val="21"/>
-        </w:rPr>
-        <w:t xml:space="preserve">deadpan, straight to camera</w:t>
+        <w:t xml:space="preserve">What to do: </w:t>
+      </w:r>
+      <w:r>
+        <w:rPr>
+          <w:color w:val="1A1A1A"/>
+          <w:sz w:val="21"/>
+          <w:szCs w:val="21"/>
+        </w:rPr>
+        <w:t xml:space="preserve">you at the desk rather than on the bed, screens off or red and out of focus behind you. Room tidied, not replaced. No zoom, no reframing, just cleaner</w:t>
       </w:r>
     </w:p>
     <w:p>
@@ -1116,6 +1439,34 @@
           <w:sz w:val="21"/>
           <w:szCs w:val="21"/>
         </w:rPr>
+        <w:t xml:space="preserve">Text on it: </w:t>
+      </w:r>
+      <w:r>
+        <w:rPr>
+          <w:color w:val="1A1A1A"/>
+          <w:sz w:val="21"/>
+          <w:szCs w:val="21"/>
+        </w:rPr>
+        <w:t xml:space="preserve">none, or a plain question in a speech bubble</w:t>
+      </w:r>
+    </w:p>
+    <w:p>
+      <w:pPr>
+        <w:pStyle w:val="ListParagraph"/>
+        <w:numPr>
+          <w:ilvl w:val="0"/>
+          <w:numId w:val="2"/>
+        </w:numPr>
+        <w:spacing w:after="90" w:line="290"/>
+      </w:pPr>
+      <w:r>
+        <w:rPr>
+          <w:b/>
+          <w:bCs/>
+          <w:color w:val="4A53D9"/>
+          <w:sz w:val="21"/>
+          <w:szCs w:val="21"/>
+        </w:rPr>
         <w:t xml:space="preserve">Why it pairs: </w:t>
       </w:r>
       <w:r>
@@ -1124,7 +1475,7 @@
           <w:sz w:val="21"/>
           <w:szCs w:val="21"/>
         </w:rPr>
-        <w:t xml:space="preserve">the title gives the payout, the thumbnail gives the survival that makes it believable</w:t>
+        <w:t xml:space="preserve">the title breaks the default behaviour, the photo shows someone who has actually had that week</w:t>
       </w:r>
     </w:p>
     <w:p>
@@ -1137,7 +1488,7 @@
           <w:sz w:val="21"/>
           <w:szCs w:val="21"/>
         </w:rPr>
-        <w:t xml:space="preserve">"Tripled my net worth" is a strong claim with one soft spot: net worth hides the starting number, and a stranger always assumes the small one. Payout consistency across five accounts is the harder thing to do and the easier thing to believe.</w:t>
+        <w:t xml:space="preserve">This one takes the psychology so the -$20,000 video can keep the numbers. Two different promises instead of one repeated one.</w:t>
       </w:r>
     </w:p>
     <w:p>
@@ -1153,7 +1504,7 @@
           <w:sz w:val="24"/>
           <w:szCs w:val="24"/>
         </w:rPr>
-        <w:t xml:space="preserve">3. Your risk management video</w:t>
+        <w:t xml:space="preserve">5. Your simplification video</w:t>
       </w:r>
     </w:p>
     <w:p>
@@ -1182,7 +1533,7 @@
           <w:sz w:val="20"/>
           <w:szCs w:val="20"/>
         </w:rPr>
-        <w:t xml:space="preserve">the risk plan that gets me 4r on nq (step by step)</w:t>
+        <w:t xml:space="preserve">you don't need more setups, you need one (full breakdown)</w:t>
       </w:r>
     </w:p>
     <w:p>
@@ -1202,16 +1553,15 @@
           <w:sz w:val="21"/>
           <w:szCs w:val="21"/>
         </w:rPr>
-        <w:t xml:space="preserve">Thumbnail text: </w:t>
-      </w:r>
-      <w:r>
-        <w:rPr>
-          <w:rFonts w:ascii="Consolas" w:cs="Consolas" w:eastAsia="Consolas" w:hAnsi="Consolas"/>
-          <w:color w:val="1A1A1A"/>
-          <w:sz w:val="20"/>
-          <w:szCs w:val="20"/>
-        </w:rPr>
-        <w:t xml:space="preserve">chop proof</w:t>
+        <w:t xml:space="preserve">Thumbnail: </w:t>
+      </w:r>
+      <w:r>
+        <w:rPr>
+          <w:color w:val="1A1A1A"/>
+          <w:sz w:val="21"/>
+          <w:szCs w:val="21"/>
+        </w:rPr>
+        <w:t xml:space="preserve">screen recording</w:t>
       </w:r>
     </w:p>
     <w:p>
@@ -1231,15 +1581,15 @@
           <w:sz w:val="21"/>
           <w:szCs w:val="21"/>
         </w:rPr>
-        <w:t xml:space="preserve">Background: </w:t>
-      </w:r>
-      <w:r>
-        <w:rPr>
-          <w:color w:val="1A1A1A"/>
-          <w:sz w:val="21"/>
-          <w:szCs w:val="21"/>
-        </w:rPr>
-        <w:t xml:space="preserve">the chart cropped to the risk box alone, no browser, face inset</w:t>
+        <w:t xml:space="preserve">What to do: </w:t>
+      </w:r>
+      <w:r>
+        <w:rPr>
+          <w:color w:val="1A1A1A"/>
+          <w:sz w:val="21"/>
+          <w:szCs w:val="21"/>
+        </w:rPr>
+        <w:t xml:space="preserve">your clean chart with the single setup marked, full frame, nothing else on screen. Face inset small</w:t>
       </w:r>
     </w:p>
     <w:p>
@@ -1259,15 +1609,15 @@
           <w:sz w:val="21"/>
           <w:szCs w:val="21"/>
         </w:rPr>
-        <w:t xml:space="preserve">Expression: </w:t>
-      </w:r>
-      <w:r>
-        <w:rPr>
-          <w:color w:val="1A1A1A"/>
-          <w:sz w:val="21"/>
-          <w:szCs w:val="21"/>
-        </w:rPr>
-        <w:t xml:space="preserve">focused, pointing at the box</w:t>
+        <w:t xml:space="preserve">Text on it: </w:t>
+      </w:r>
+      <w:r>
+        <w:rPr>
+          <w:color w:val="1A1A1A"/>
+          <w:sz w:val="21"/>
+          <w:szCs w:val="21"/>
+        </w:rPr>
+        <w:t xml:space="preserve">none</w:t>
       </w:r>
     </w:p>
     <w:p>
@@ -1295,7 +1645,7 @@
           <w:sz w:val="21"/>
           <w:szCs w:val="21"/>
         </w:rPr>
-        <w:t xml:space="preserve">the title gives the method and the ratio, the thumbnail names the condition it survives</w:t>
+        <w:t xml:space="preserve">the title makes the claim, the empty chart is the evidence</w:t>
       </w:r>
     </w:p>
     <w:p>
@@ -1308,349 +1658,7 @@
           <w:sz w:val="21"/>
           <w:szCs w:val="21"/>
         </w:rPr>
-        <w:t xml:space="preserve">Your existing frame is the best of the five by accident. There is a real risk box on a real chart in it, buried under the interface. Crop to the box and it works.</w:t>
-      </w:r>
-    </w:p>
-    <w:p>
-      <w:pPr>
-        <w:pStyle w:val="Heading2"/>
-        <w:spacing w:after="120" w:before="300"/>
-      </w:pPr>
-      <w:r>
-        <w:rPr>
-          <w:b/>
-          <w:bCs/>
-          <w:color w:val="1A1A1A"/>
-          <w:sz w:val="24"/>
-          <w:szCs w:val="24"/>
-        </w:rPr>
-        <w:t xml:space="preserve">4. Your losing weeks video</w:t>
-      </w:r>
-    </w:p>
-    <w:p>
-      <w:pPr>
-        <w:pStyle w:val="ListParagraph"/>
-        <w:numPr>
-          <w:ilvl w:val="0"/>
-          <w:numId w:val="2"/>
-        </w:numPr>
-        <w:spacing w:after="90" w:line="290"/>
-      </w:pPr>
-      <w:r>
-        <w:rPr>
-          <w:b/>
-          <w:bCs/>
-          <w:color w:val="4A53D9"/>
-          <w:sz w:val="21"/>
-          <w:szCs w:val="21"/>
-        </w:rPr>
-        <w:t xml:space="preserve">Title: </w:t>
-      </w:r>
-      <w:r>
-        <w:rPr>
-          <w:rFonts w:ascii="Consolas" w:cs="Consolas" w:eastAsia="Consolas" w:hAnsi="Consolas"/>
-          <w:color w:val="1A1A1A"/>
-          <w:sz w:val="20"/>
-          <w:szCs w:val="20"/>
-        </w:rPr>
-        <w:t xml:space="preserve">stop trading after a red week, do this instead (copy me)</w:t>
-      </w:r>
-    </w:p>
-    <w:p>
-      <w:pPr>
-        <w:pStyle w:val="ListParagraph"/>
-        <w:numPr>
-          <w:ilvl w:val="0"/>
-          <w:numId w:val="2"/>
-        </w:numPr>
-        <w:spacing w:after="90" w:line="290"/>
-      </w:pPr>
-      <w:r>
-        <w:rPr>
-          <w:b/>
-          <w:bCs/>
-          <w:color w:val="4A53D9"/>
-          <w:sz w:val="21"/>
-          <w:szCs w:val="21"/>
-        </w:rPr>
-        <w:t xml:space="preserve">Thumbnail text: </w:t>
-      </w:r>
-      <w:r>
-        <w:rPr>
-          <w:rFonts w:ascii="Consolas" w:cs="Consolas" w:eastAsia="Consolas" w:hAnsi="Consolas"/>
-          <w:color w:val="1A1A1A"/>
-          <w:sz w:val="20"/>
-          <w:szCs w:val="20"/>
-        </w:rPr>
-        <w:t xml:space="preserve">walk away monday</w:t>
-      </w:r>
-    </w:p>
-    <w:p>
-      <w:pPr>
-        <w:pStyle w:val="ListParagraph"/>
-        <w:numPr>
-          <w:ilvl w:val="0"/>
-          <w:numId w:val="2"/>
-        </w:numPr>
-        <w:spacing w:after="90" w:line="290"/>
-      </w:pPr>
-      <w:r>
-        <w:rPr>
-          <w:b/>
-          <w:bCs/>
-          <w:color w:val="4A53D9"/>
-          <w:sz w:val="21"/>
-          <w:szCs w:val="21"/>
-        </w:rPr>
-        <w:t xml:space="preserve">Background: </w:t>
-      </w:r>
-      <w:r>
-        <w:rPr>
-          <w:color w:val="1A1A1A"/>
-          <w:sz w:val="21"/>
-          <w:szCs w:val="21"/>
-        </w:rPr>
-        <w:t xml:space="preserve">clean desk, screens off, face inset</w:t>
-      </w:r>
-    </w:p>
-    <w:p>
-      <w:pPr>
-        <w:pStyle w:val="ListParagraph"/>
-        <w:numPr>
-          <w:ilvl w:val="0"/>
-          <w:numId w:val="2"/>
-        </w:numPr>
-        <w:spacing w:after="90" w:line="290"/>
-      </w:pPr>
-      <w:r>
-        <w:rPr>
-          <w:b/>
-          <w:bCs/>
-          <w:color w:val="4A53D9"/>
-          <w:sz w:val="21"/>
-          <w:szCs w:val="21"/>
-        </w:rPr>
-        <w:t xml:space="preserve">Expression: </w:t>
-      </w:r>
-      <w:r>
-        <w:rPr>
-          <w:color w:val="1A1A1A"/>
-          <w:sz w:val="21"/>
-          <w:szCs w:val="21"/>
-        </w:rPr>
-        <w:t xml:space="preserve">deadpan</w:t>
-      </w:r>
-    </w:p>
-    <w:p>
-      <w:pPr>
-        <w:pStyle w:val="ListParagraph"/>
-        <w:numPr>
-          <w:ilvl w:val="0"/>
-          <w:numId w:val="2"/>
-        </w:numPr>
-        <w:spacing w:after="90" w:line="290"/>
-      </w:pPr>
-      <w:r>
-        <w:rPr>
-          <w:b/>
-          <w:bCs/>
-          <w:color w:val="4A53D9"/>
-          <w:sz w:val="21"/>
-          <w:szCs w:val="21"/>
-        </w:rPr>
-        <w:t xml:space="preserve">Why it pairs: </w:t>
-      </w:r>
-      <w:r>
-        <w:rPr>
-          <w:color w:val="1A1A1A"/>
-          <w:sz w:val="21"/>
-          <w:szCs w:val="21"/>
-        </w:rPr>
-        <w:t xml:space="preserve">the title breaks the default behaviour, the thumbnail names the replacement</w:t>
-      </w:r>
-    </w:p>
-    <w:p>
-      <w:pPr>
-        <w:spacing w:after="200" w:line="300"/>
-      </w:pPr>
-      <w:r>
-        <w:rPr>
-          <w:color w:val="5C6472"/>
-          <w:sz w:val="21"/>
-          <w:szCs w:val="21"/>
-        </w:rPr>
-        <w:t xml:space="preserve">This one takes the psychology so the -$20,000 video can keep the numbers. Two different promises instead of one repeated one.</w:t>
-      </w:r>
-    </w:p>
-    <w:p>
-      <w:pPr>
-        <w:pStyle w:val="Heading2"/>
-        <w:spacing w:after="120" w:before="300"/>
-      </w:pPr>
-      <w:r>
-        <w:rPr>
-          <w:b/>
-          <w:bCs/>
-          <w:color w:val="1A1A1A"/>
-          <w:sz w:val="24"/>
-          <w:szCs w:val="24"/>
-        </w:rPr>
-        <w:t xml:space="preserve">5. Your simplification video</w:t>
-      </w:r>
-    </w:p>
-    <w:p>
-      <w:pPr>
-        <w:pStyle w:val="ListParagraph"/>
-        <w:numPr>
-          <w:ilvl w:val="0"/>
-          <w:numId w:val="2"/>
-        </w:numPr>
-        <w:spacing w:after="90" w:line="290"/>
-      </w:pPr>
-      <w:r>
-        <w:rPr>
-          <w:b/>
-          <w:bCs/>
-          <w:color w:val="4A53D9"/>
-          <w:sz w:val="21"/>
-          <w:szCs w:val="21"/>
-        </w:rPr>
-        <w:t xml:space="preserve">Title: </w:t>
-      </w:r>
-      <w:r>
-        <w:rPr>
-          <w:rFonts w:ascii="Consolas" w:cs="Consolas" w:eastAsia="Consolas" w:hAnsi="Consolas"/>
-          <w:color w:val="1A1A1A"/>
-          <w:sz w:val="20"/>
-          <w:szCs w:val="20"/>
-        </w:rPr>
-        <w:t xml:space="preserve">you don't need more setups, you need one (full breakdown)</w:t>
-      </w:r>
-    </w:p>
-    <w:p>
-      <w:pPr>
-        <w:pStyle w:val="ListParagraph"/>
-        <w:numPr>
-          <w:ilvl w:val="0"/>
-          <w:numId w:val="2"/>
-        </w:numPr>
-        <w:spacing w:after="90" w:line="290"/>
-      </w:pPr>
-      <w:r>
-        <w:rPr>
-          <w:b/>
-          <w:bCs/>
-          <w:color w:val="4A53D9"/>
-          <w:sz w:val="21"/>
-          <w:szCs w:val="21"/>
-        </w:rPr>
-        <w:t xml:space="preserve">Thumbnail text: </w:t>
-      </w:r>
-      <w:r>
-        <w:rPr>
-          <w:rFonts w:ascii="Consolas" w:cs="Consolas" w:eastAsia="Consolas" w:hAnsi="Consolas"/>
-          <w:color w:val="1A1A1A"/>
-          <w:sz w:val="20"/>
-          <w:szCs w:val="20"/>
-        </w:rPr>
-        <w:t xml:space="preserve">delete the rest</w:t>
-      </w:r>
-    </w:p>
-    <w:p>
-      <w:pPr>
-        <w:pStyle w:val="ListParagraph"/>
-        <w:numPr>
-          <w:ilvl w:val="0"/>
-          <w:numId w:val="2"/>
-        </w:numPr>
-        <w:spacing w:after="90" w:line="290"/>
-      </w:pPr>
-      <w:r>
-        <w:rPr>
-          <w:b/>
-          <w:bCs/>
-          <w:color w:val="4A53D9"/>
-          <w:sz w:val="21"/>
-          <w:szCs w:val="21"/>
-        </w:rPr>
-        <w:t xml:space="preserve">Background: </w:t>
-      </w:r>
-      <w:r>
-        <w:rPr>
-          <w:color w:val="1A1A1A"/>
-          <w:sz w:val="21"/>
-          <w:szCs w:val="21"/>
-        </w:rPr>
-        <w:t xml:space="preserve">one clean chart with a single setup marked, face inset</w:t>
-      </w:r>
-    </w:p>
-    <w:p>
-      <w:pPr>
-        <w:pStyle w:val="ListParagraph"/>
-        <w:numPr>
-          <w:ilvl w:val="0"/>
-          <w:numId w:val="2"/>
-        </w:numPr>
-        <w:spacing w:after="90" w:line="290"/>
-      </w:pPr>
-      <w:r>
-        <w:rPr>
-          <w:b/>
-          <w:bCs/>
-          <w:color w:val="4A53D9"/>
-          <w:sz w:val="21"/>
-          <w:szCs w:val="21"/>
-        </w:rPr>
-        <w:t xml:space="preserve">Expression: </w:t>
-      </w:r>
-      <w:r>
-        <w:rPr>
-          <w:color w:val="1A1A1A"/>
-          <w:sz w:val="21"/>
-          <w:szCs w:val="21"/>
-        </w:rPr>
-        <w:t xml:space="preserve">deadpan, slight smirk</w:t>
-      </w:r>
-    </w:p>
-    <w:p>
-      <w:pPr>
-        <w:pStyle w:val="ListParagraph"/>
-        <w:numPr>
-          <w:ilvl w:val="0"/>
-          <w:numId w:val="2"/>
-        </w:numPr>
-        <w:spacing w:after="90" w:line="290"/>
-      </w:pPr>
-      <w:r>
-        <w:rPr>
-          <w:b/>
-          <w:bCs/>
-          <w:color w:val="4A53D9"/>
-          <w:sz w:val="21"/>
-          <w:szCs w:val="21"/>
-        </w:rPr>
-        <w:t xml:space="preserve">Why it pairs: </w:t>
-      </w:r>
-      <w:r>
-        <w:rPr>
-          <w:color w:val="1A1A1A"/>
-          <w:sz w:val="21"/>
-          <w:szCs w:val="21"/>
-        </w:rPr>
-        <w:t xml:space="preserve">the title makes the claim, the thumbnail gives the action</w:t>
-      </w:r>
-    </w:p>
-    <w:p>
-      <w:pPr>
-        <w:spacing w:after="200" w:line="300"/>
-      </w:pPr>
-      <w:r>
-        <w:rPr>
-          <w:color w:val="5C6472"/>
-          <w:sz w:val="21"/>
-          <w:szCs w:val="21"/>
-        </w:rPr>
-        <w:t xml:space="preserve">One note on all five backgrounds: get off the bed. A bedroom with a closet in shot is the fastest way to read as an amateur at thumbnail size, and you are not one.</w:t>
+        <w:t xml:space="preserve">One note on the two photo thumbnails: get off the bed. A bedroom with a closet in shot is the fastest way to read as an amateur at 120px, and you are not one. Same room is fine, just sit at the desk and tidy what is behind you.</w:t>
       </w:r>
     </w:p>
     <w:p>

</xml_diff>